<commit_message>
Diagramas unifilar e multifilar dos quadros de distribuição
- Diagramas gerados a partir do dimensionamento: alimentação, disjuntor
  geral, DPS classe II, disjuntores, DR (IDR/DDR), condutores com seções
  e distribuição entre as fases; símbolos IEC 60617 e cores da NBR 5410.
- Unifilar com barramento vertical, marcas de fase/neutro/PE, reserva da
  Tabela 59 e resumo de demanda e equilíbrio; multifilar com barramentos
  A, B, C, N e PE coloridos, polos, toróide do DR e DPS ligados ao PE.
- Seção Quadros: botões unifilar/multifilar, campos de disjuntor geral e
  DPS; documento "Diagramas unifilares e multifilares" em PDF, Word e
  HTML, anexável ao memorial descritivo; DPS na lista de materiais.
- Exportação com figuras de largura total em alta resolução e títulos
  mantidos junto da figura.

Co-Authored-By: Claude Opus 5.5 <noreply@anthropic.com>
Claude-Session: https://claude.ai/code/session_01E4Px4gvzC9MkKBX1rn21ys
</commit_message>
<xml_diff>
--- a/exemplo/lista-de-materiais-residencia-unifamiliar-exemplo-r00.docx
+++ b/exemplo/lista-de-materiais-residencia-unifamiliar-exemplo-r00.docx
@@ -5835,7 +5835,7 @@
                 <w:szCs w:val="15"/>
                 <w:rFonts w:ascii="Calibri" w:cs="Calibri" w:eastAsia="Calibri" w:hAnsi="Calibri"/>
               </w:rPr>
-              <w:t xml:space="preserve">Disjuntor termomagnético 1P curva C 10 A — 6,0 kA</w:t>
+              <w:t xml:space="preserve">DPS classe II — Uc 175 V, In 20 kA, Imáx 40 kA</w:t>
             </w:r>
           </w:p>
         </w:tc>
@@ -5859,7 +5859,7 @@
                 <w:szCs w:val="15"/>
                 <w:rFonts w:ascii="Calibri" w:cs="Calibri" w:eastAsia="Calibri" w:hAnsi="Calibri"/>
               </w:rPr>
-              <w:t xml:space="preserve">ABNT NBR NM 60898</w:t>
+              <w:t xml:space="preserve">ABNT NBR IEC 61643-11</w:t>
             </w:r>
           </w:p>
         </w:tc>
@@ -5931,7 +5931,7 @@
                 <w:szCs w:val="15"/>
                 <w:rFonts w:ascii="Calibri" w:cs="Calibri" w:eastAsia="Calibri" w:hAnsi="Calibri"/>
               </w:rPr>
-              <w:t xml:space="preserve">5</w:t>
+              <w:t xml:space="preserve">8</w:t>
             </w:r>
           </w:p>
         </w:tc>
@@ -5984,7 +5984,7 @@
                 <w:szCs w:val="15"/>
                 <w:rFonts w:ascii="Calibri" w:cs="Calibri" w:eastAsia="Calibri" w:hAnsi="Calibri"/>
               </w:rPr>
-              <w:t xml:space="preserve">Disjuntor termomagnético 1P curva C 16 A — 6,0 kA</w:t>
+              <w:t xml:space="preserve">Disjuntor termomagnético 1P curva C 10 A — 6,0 kA</w:t>
             </w:r>
           </w:p>
         </w:tc>
@@ -6080,7 +6080,7 @@
                 <w:szCs w:val="15"/>
                 <w:rFonts w:ascii="Calibri" w:cs="Calibri" w:eastAsia="Calibri" w:hAnsi="Calibri"/>
               </w:rPr>
-              <w:t xml:space="preserve">4</w:t>
+              <w:t xml:space="preserve">5</w:t>
             </w:r>
           </w:p>
         </w:tc>
@@ -6133,7 +6133,7 @@
                 <w:szCs w:val="15"/>
                 <w:rFonts w:ascii="Calibri" w:cs="Calibri" w:eastAsia="Calibri" w:hAnsi="Calibri"/>
               </w:rPr>
-              <w:t xml:space="preserve">Disjuntor termomagnético 2P curva C 10 A — 6,0 kA</w:t>
+              <w:t xml:space="preserve">Disjuntor termomagnético 1P curva C 16 A — 6,0 kA</w:t>
             </w:r>
           </w:p>
         </w:tc>
@@ -6229,7 +6229,7 @@
                 <w:szCs w:val="15"/>
                 <w:rFonts w:ascii="Calibri" w:cs="Calibri" w:eastAsia="Calibri" w:hAnsi="Calibri"/>
               </w:rPr>
-              <w:t xml:space="preserve">2</w:t>
+              <w:t xml:space="preserve">4</w:t>
             </w:r>
           </w:p>
         </w:tc>
@@ -6282,7 +6282,7 @@
                 <w:szCs w:val="15"/>
                 <w:rFonts w:ascii="Calibri" w:cs="Calibri" w:eastAsia="Calibri" w:hAnsi="Calibri"/>
               </w:rPr>
-              <w:t xml:space="preserve">Disjuntor termomagnético 2P curva C 25 A — 6,0 kA</w:t>
+              <w:t xml:space="preserve">Disjuntor termomagnético 2P curva C 10 A — 6,0 kA</w:t>
             </w:r>
           </w:p>
         </w:tc>
@@ -6378,7 +6378,7 @@
                 <w:szCs w:val="15"/>
                 <w:rFonts w:ascii="Calibri" w:cs="Calibri" w:eastAsia="Calibri" w:hAnsi="Calibri"/>
               </w:rPr>
-              <w:t xml:space="preserve">1</w:t>
+              <w:t xml:space="preserve">2</w:t>
             </w:r>
           </w:p>
         </w:tc>
@@ -6431,7 +6431,7 @@
                 <w:szCs w:val="15"/>
                 <w:rFonts w:ascii="Calibri" w:cs="Calibri" w:eastAsia="Calibri" w:hAnsi="Calibri"/>
               </w:rPr>
-              <w:t xml:space="preserve">Disjuntor termomagnético 2P curva C 40 A — 6,0 kA</w:t>
+              <w:t xml:space="preserve">Disjuntor termomagnético 2P curva C 25 A — 6,0 kA</w:t>
             </w:r>
           </w:p>
         </w:tc>
@@ -6580,7 +6580,7 @@
                 <w:szCs w:val="15"/>
                 <w:rFonts w:ascii="Calibri" w:cs="Calibri" w:eastAsia="Calibri" w:hAnsi="Calibri"/>
               </w:rPr>
-              <w:t xml:space="preserve">Disjuntor termomagnético 3P curva C 63 A — 6,0 kA</w:t>
+              <w:t xml:space="preserve">Disjuntor termomagnético 2P curva C 40 A — 6,0 kA</w:t>
             </w:r>
           </w:p>
         </w:tc>
@@ -6729,7 +6729,7 @@
                 <w:szCs w:val="15"/>
                 <w:rFonts w:ascii="Calibri" w:cs="Calibri" w:eastAsia="Calibri" w:hAnsi="Calibri"/>
               </w:rPr>
-              <w:t xml:space="preserve">Interruptor diferencial-residual (IDR) 2P 25 A — 30 mA</w:t>
+              <w:t xml:space="preserve">Disjuntor termomagnético 3P curva C 63 A — 6,0 kA</w:t>
             </w:r>
           </w:p>
         </w:tc>
@@ -6753,7 +6753,7 @@
                 <w:szCs w:val="15"/>
                 <w:rFonts w:ascii="Calibri" w:cs="Calibri" w:eastAsia="Calibri" w:hAnsi="Calibri"/>
               </w:rPr>
-              <w:t xml:space="preserve">ABNT NBR NM 61008</w:t>
+              <w:t xml:space="preserve">ABNT NBR NM 60898</w:t>
             </w:r>
           </w:p>
         </w:tc>
@@ -6825,7 +6825,7 @@
                 <w:szCs w:val="15"/>
                 <w:rFonts w:ascii="Calibri" w:cs="Calibri" w:eastAsia="Calibri" w:hAnsi="Calibri"/>
               </w:rPr>
-              <w:t xml:space="preserve">9</w:t>
+              <w:t xml:space="preserve">1</w:t>
             </w:r>
           </w:p>
         </w:tc>
@@ -6878,7 +6878,7 @@
                 <w:szCs w:val="15"/>
                 <w:rFonts w:ascii="Calibri" w:cs="Calibri" w:eastAsia="Calibri" w:hAnsi="Calibri"/>
               </w:rPr>
-              <w:t xml:space="preserve">Interruptor diferencial-residual (IDR) 2P 40 A — 30 mA</w:t>
+              <w:t xml:space="preserve">Interruptor diferencial-residual (IDR) 2P 25 A — 30 mA</w:t>
             </w:r>
           </w:p>
         </w:tc>
@@ -6974,7 +6974,7 @@
                 <w:szCs w:val="15"/>
                 <w:rFonts w:ascii="Calibri" w:cs="Calibri" w:eastAsia="Calibri" w:hAnsi="Calibri"/>
               </w:rPr>
-              <w:t xml:space="preserve">1</w:t>
+              <w:t xml:space="preserve">9</w:t>
             </w:r>
           </w:p>
         </w:tc>
@@ -7004,6 +7004,155 @@
                 <w:rFonts w:ascii="Calibri" w:cs="Calibri" w:eastAsia="Calibri" w:hAnsi="Calibri"/>
               </w:rPr>
               <w:t xml:space="preserve">41</w:t>
+            </w:r>
+          </w:p>
+        </w:tc>
+        <w:tc>
+          <w:tcPr>
+            <w:tcW w:type="dxa" w:w="4390"/>
+            <w:tcMar>
+              <w:top w:type="dxa" w:w="30"/>
+              <w:left w:type="dxa" w:w="70"/>
+              <w:bottom w:type="dxa" w:w="30"/>
+              <w:right w:type="dxa" w:w="70"/>
+            </w:tcMar>
+          </w:tcPr>
+          <w:p>
+            <w:pPr>
+              <w:jc w:val="left"/>
+            </w:pPr>
+            <w:r>
+              <w:rPr>
+                <w:sz w:val="15"/>
+                <w:szCs w:val="15"/>
+                <w:rFonts w:ascii="Calibri" w:cs="Calibri" w:eastAsia="Calibri" w:hAnsi="Calibri"/>
+              </w:rPr>
+              <w:t xml:space="preserve">Interruptor diferencial-residual (IDR) 2P 40 A — 30 mA</w:t>
+            </w:r>
+          </w:p>
+        </w:tc>
+        <w:tc>
+          <w:tcPr>
+            <w:tcW w:type="dxa" w:w="1951"/>
+            <w:tcMar>
+              <w:top w:type="dxa" w:w="30"/>
+              <w:left w:type="dxa" w:w="70"/>
+              <w:bottom w:type="dxa" w:w="30"/>
+              <w:right w:type="dxa" w:w="70"/>
+            </w:tcMar>
+          </w:tcPr>
+          <w:p>
+            <w:pPr>
+              <w:jc w:val="left"/>
+            </w:pPr>
+            <w:r>
+              <w:rPr>
+                <w:sz w:val="15"/>
+                <w:szCs w:val="15"/>
+                <w:rFonts w:ascii="Calibri" w:cs="Calibri" w:eastAsia="Calibri" w:hAnsi="Calibri"/>
+              </w:rPr>
+              <w:t xml:space="preserve">ABNT NBR NM 61008</w:t>
+            </w:r>
+          </w:p>
+        </w:tc>
+        <w:tc>
+          <w:tcPr>
+            <w:tcW w:type="dxa" w:w="1171"/>
+            <w:tcMar>
+              <w:top w:type="dxa" w:w="30"/>
+              <w:left w:type="dxa" w:w="70"/>
+              <w:bottom w:type="dxa" w:w="30"/>
+              <w:right w:type="dxa" w:w="70"/>
+            </w:tcMar>
+          </w:tcPr>
+          <w:p>
+            <w:pPr>
+              <w:jc w:val="left"/>
+            </w:pPr>
+            <w:r>
+              <w:rPr>
+                <w:sz w:val="15"/>
+                <w:szCs w:val="15"/>
+                <w:rFonts w:ascii="Calibri" w:cs="Calibri" w:eastAsia="Calibri" w:hAnsi="Calibri"/>
+              </w:rPr>
+              <w:t xml:space="preserve">—</w:t>
+            </w:r>
+          </w:p>
+        </w:tc>
+        <w:tc>
+          <w:tcPr>
+            <w:tcW w:type="dxa" w:w="683"/>
+            <w:tcMar>
+              <w:top w:type="dxa" w:w="30"/>
+              <w:left w:type="dxa" w:w="70"/>
+              <w:bottom w:type="dxa" w:w="30"/>
+              <w:right w:type="dxa" w:w="70"/>
+            </w:tcMar>
+          </w:tcPr>
+          <w:p>
+            <w:pPr>
+              <w:jc w:val="left"/>
+            </w:pPr>
+            <w:r>
+              <w:rPr>
+                <w:sz w:val="15"/>
+                <w:szCs w:val="15"/>
+                <w:rFonts w:ascii="Calibri" w:cs="Calibri" w:eastAsia="Calibri" w:hAnsi="Calibri"/>
+              </w:rPr>
+              <w:t xml:space="preserve">un</w:t>
+            </w:r>
+          </w:p>
+        </w:tc>
+        <w:tc>
+          <w:tcPr>
+            <w:tcW w:type="dxa" w:w="878"/>
+            <w:tcMar>
+              <w:top w:type="dxa" w:w="30"/>
+              <w:left w:type="dxa" w:w="70"/>
+              <w:bottom w:type="dxa" w:w="30"/>
+              <w:right w:type="dxa" w:w="70"/>
+            </w:tcMar>
+          </w:tcPr>
+          <w:p>
+            <w:pPr>
+              <w:jc w:val="right"/>
+            </w:pPr>
+            <w:r>
+              <w:rPr>
+                <w:sz w:val="15"/>
+                <w:szCs w:val="15"/>
+                <w:rFonts w:ascii="Calibri" w:cs="Calibri" w:eastAsia="Calibri" w:hAnsi="Calibri"/>
+              </w:rPr>
+              <w:t xml:space="preserve">1</w:t>
+            </w:r>
+          </w:p>
+        </w:tc>
+      </w:tr>
+      <w:tr>
+        <w:trPr>
+          <w:cantSplit/>
+        </w:trPr>
+        <w:tc>
+          <w:tcPr>
+            <w:tcW w:type="dxa" w:w="683"/>
+            <w:tcMar>
+              <w:top w:type="dxa" w:w="30"/>
+              <w:left w:type="dxa" w:w="70"/>
+              <w:bottom w:type="dxa" w:w="30"/>
+              <w:right w:type="dxa" w:w="70"/>
+            </w:tcMar>
+          </w:tcPr>
+          <w:p>
+            <w:pPr>
+              <w:jc w:val="left"/>
+            </w:pPr>
+            <w:r>
+              <w:rPr>
+                <w:sz w:val="15"/>
+                <w:szCs w:val="15"/>
+                <w:rFonts w:ascii="Calibri" w:cs="Calibri" w:eastAsia="Calibri" w:hAnsi="Calibri"/>
+              </w:rPr>
+              <w:t xml:space="preserve">42</w:t>
             </w:r>
           </w:p>
         </w:tc>
@@ -7368,7 +7517,7 @@
                 <w:szCs w:val="15"/>
                 <w:rFonts w:ascii="Calibri" w:cs="Calibri" w:eastAsia="Calibri" w:hAnsi="Calibri"/>
               </w:rPr>
-              <w:t xml:space="preserve">42</w:t>
+              <w:t xml:space="preserve">43</w:t>
             </w:r>
           </w:p>
         </w:tc>
@@ -7517,7 +7666,7 @@
                 <w:szCs w:val="15"/>
                 <w:rFonts w:ascii="Calibri" w:cs="Calibri" w:eastAsia="Calibri" w:hAnsi="Calibri"/>
               </w:rPr>
-              <w:t xml:space="preserve">43</w:t>
+              <w:t xml:space="preserve">44</w:t>
             </w:r>
           </w:p>
         </w:tc>
@@ -7666,7 +7815,7 @@
                 <w:szCs w:val="15"/>
                 <w:rFonts w:ascii="Calibri" w:cs="Calibri" w:eastAsia="Calibri" w:hAnsi="Calibri"/>
               </w:rPr>
-              <w:t xml:space="preserve">44</w:t>
+              <w:t xml:space="preserve">45</w:t>
             </w:r>
           </w:p>
         </w:tc>
@@ -8031,7 +8180,7 @@
                 <w:szCs w:val="15"/>
                 <w:rFonts w:ascii="Calibri" w:cs="Calibri" w:eastAsia="Calibri" w:hAnsi="Calibri"/>
               </w:rPr>
-              <w:t xml:space="preserve">45</w:t>
+              <w:t xml:space="preserve">46</w:t>
             </w:r>
           </w:p>
         </w:tc>
@@ -8180,7 +8329,7 @@
                 <w:szCs w:val="15"/>
                 <w:rFonts w:ascii="Calibri" w:cs="Calibri" w:eastAsia="Calibri" w:hAnsi="Calibri"/>
               </w:rPr>
-              <w:t xml:space="preserve">46</w:t>
+              <w:t xml:space="preserve">47</w:t>
             </w:r>
           </w:p>
         </w:tc>
@@ -8329,7 +8478,7 @@
                 <w:szCs w:val="15"/>
                 <w:rFonts w:ascii="Calibri" w:cs="Calibri" w:eastAsia="Calibri" w:hAnsi="Calibri"/>
               </w:rPr>
-              <w:t xml:space="preserve">47</w:t>
+              <w:t xml:space="preserve">48</w:t>
             </w:r>
           </w:p>
         </w:tc>
@@ -8478,7 +8627,7 @@
                 <w:szCs w:val="15"/>
                 <w:rFonts w:ascii="Calibri" w:cs="Calibri" w:eastAsia="Calibri" w:hAnsi="Calibri"/>
               </w:rPr>
-              <w:t xml:space="preserve">48</w:t>
+              <w:t xml:space="preserve">49</w:t>
             </w:r>
           </w:p>
         </w:tc>
@@ -8627,7 +8776,7 @@
                 <w:szCs w:val="15"/>
                 <w:rFonts w:ascii="Calibri" w:cs="Calibri" w:eastAsia="Calibri" w:hAnsi="Calibri"/>
               </w:rPr>
-              <w:t xml:space="preserve">49</w:t>
+              <w:t xml:space="preserve">50</w:t>
             </w:r>
           </w:p>
         </w:tc>
@@ -8776,7 +8925,7 @@
                 <w:szCs w:val="15"/>
                 <w:rFonts w:ascii="Calibri" w:cs="Calibri" w:eastAsia="Calibri" w:hAnsi="Calibri"/>
               </w:rPr>
-              <w:t xml:space="preserve">50</w:t>
+              <w:t xml:space="preserve">51</w:t>
             </w:r>
           </w:p>
         </w:tc>
@@ -9141,7 +9290,7 @@
                 <w:szCs w:val="15"/>
                 <w:rFonts w:ascii="Calibri" w:cs="Calibri" w:eastAsia="Calibri" w:hAnsi="Calibri"/>
               </w:rPr>
-              <w:t xml:space="preserve">51</w:t>
+              <w:t xml:space="preserve">52</w:t>
             </w:r>
           </w:p>
         </w:tc>
@@ -9290,7 +9439,7 @@
                 <w:szCs w:val="15"/>
                 <w:rFonts w:ascii="Calibri" w:cs="Calibri" w:eastAsia="Calibri" w:hAnsi="Calibri"/>
               </w:rPr>
-              <w:t xml:space="preserve">52</w:t>
+              <w:t xml:space="preserve">53</w:t>
             </w:r>
           </w:p>
         </w:tc>
@@ -9655,7 +9804,7 @@
                 <w:szCs w:val="15"/>
                 <w:rFonts w:ascii="Calibri" w:cs="Calibri" w:eastAsia="Calibri" w:hAnsi="Calibri"/>
               </w:rPr>
-              <w:t xml:space="preserve">53</w:t>
+              <w:t xml:space="preserve">54</w:t>
             </w:r>
           </w:p>
         </w:tc>
@@ -9804,7 +9953,7 @@
                 <w:szCs w:val="15"/>
                 <w:rFonts w:ascii="Calibri" w:cs="Calibri" w:eastAsia="Calibri" w:hAnsi="Calibri"/>
               </w:rPr>
-              <w:t xml:space="preserve">54</w:t>
+              <w:t xml:space="preserve">55</w:t>
             </w:r>
           </w:p>
         </w:tc>
@@ -9953,7 +10102,7 @@
                 <w:szCs w:val="15"/>
                 <w:rFonts w:ascii="Calibri" w:cs="Calibri" w:eastAsia="Calibri" w:hAnsi="Calibri"/>
               </w:rPr>
-              <w:t xml:space="preserve">55</w:t>
+              <w:t xml:space="preserve">56</w:t>
             </w:r>
           </w:p>
         </w:tc>
@@ -10102,7 +10251,7 @@
                 <w:szCs w:val="15"/>
                 <w:rFonts w:ascii="Calibri" w:cs="Calibri" w:eastAsia="Calibri" w:hAnsi="Calibri"/>
               </w:rPr>
-              <w:t xml:space="preserve">56</w:t>
+              <w:t xml:space="preserve">57</w:t>
             </w:r>
           </w:p>
         </w:tc>
@@ -10251,7 +10400,7 @@
                 <w:szCs w:val="15"/>
                 <w:rFonts w:ascii="Calibri" w:cs="Calibri" w:eastAsia="Calibri" w:hAnsi="Calibri"/>
               </w:rPr>
-              <w:t xml:space="preserve">57</w:t>
+              <w:t xml:space="preserve">58</w:t>
             </w:r>
           </w:p>
         </w:tc>
@@ -10616,7 +10765,7 @@
                 <w:szCs w:val="15"/>
                 <w:rFonts w:ascii="Calibri" w:cs="Calibri" w:eastAsia="Calibri" w:hAnsi="Calibri"/>
               </w:rPr>
-              <w:t xml:space="preserve">58</w:t>
+              <w:t xml:space="preserve">59</w:t>
             </w:r>
           </w:p>
         </w:tc>
@@ -10765,7 +10914,7 @@
                 <w:szCs w:val="15"/>
                 <w:rFonts w:ascii="Calibri" w:cs="Calibri" w:eastAsia="Calibri" w:hAnsi="Calibri"/>
               </w:rPr>
-              <w:t xml:space="preserve">59</w:t>
+              <w:t xml:space="preserve">60</w:t>
             </w:r>
           </w:p>
         </w:tc>
@@ -10914,7 +11063,7 @@
                 <w:szCs w:val="15"/>
                 <w:rFonts w:ascii="Calibri" w:cs="Calibri" w:eastAsia="Calibri" w:hAnsi="Calibri"/>
               </w:rPr>
-              <w:t xml:space="preserve">60</w:t>
+              <w:t xml:space="preserve">61</w:t>
             </w:r>
           </w:p>
         </w:tc>
@@ -11063,7 +11212,7 @@
                 <w:szCs w:val="15"/>
                 <w:rFonts w:ascii="Calibri" w:cs="Calibri" w:eastAsia="Calibri" w:hAnsi="Calibri"/>
               </w:rPr>
-              <w:t xml:space="preserve">61</w:t>
+              <w:t xml:space="preserve">62</w:t>
             </w:r>
           </w:p>
         </w:tc>
@@ -11212,7 +11361,7 @@
                 <w:szCs w:val="15"/>
                 <w:rFonts w:ascii="Calibri" w:cs="Calibri" w:eastAsia="Calibri" w:hAnsi="Calibri"/>
               </w:rPr>
-              <w:t xml:space="preserve">62</w:t>
+              <w:t xml:space="preserve">63</w:t>
             </w:r>
           </w:p>
         </w:tc>
@@ -11361,7 +11510,7 @@
                 <w:szCs w:val="15"/>
                 <w:rFonts w:ascii="Calibri" w:cs="Calibri" w:eastAsia="Calibri" w:hAnsi="Calibri"/>
               </w:rPr>
-              <w:t xml:space="preserve">63</w:t>
+              <w:t xml:space="preserve">64</w:t>
             </w:r>
           </w:p>
         </w:tc>
@@ -11510,7 +11659,7 @@
                 <w:szCs w:val="15"/>
                 <w:rFonts w:ascii="Calibri" w:cs="Calibri" w:eastAsia="Calibri" w:hAnsi="Calibri"/>
               </w:rPr>
-              <w:t xml:space="preserve">64</w:t>
+              <w:t xml:space="preserve">65</w:t>
             </w:r>
           </w:p>
         </w:tc>
@@ -11875,7 +12024,7 @@
                 <w:szCs w:val="15"/>
                 <w:rFonts w:ascii="Calibri" w:cs="Calibri" w:eastAsia="Calibri" w:hAnsi="Calibri"/>
               </w:rPr>
-              <w:t xml:space="preserve">65</w:t>
+              <w:t xml:space="preserve">66</w:t>
             </w:r>
           </w:p>
         </w:tc>
@@ -12024,7 +12173,7 @@
                 <w:szCs w:val="15"/>
                 <w:rFonts w:ascii="Calibri" w:cs="Calibri" w:eastAsia="Calibri" w:hAnsi="Calibri"/>
               </w:rPr>
-              <w:t xml:space="preserve">66</w:t>
+              <w:t xml:space="preserve">67</w:t>
             </w:r>
           </w:p>
         </w:tc>
@@ -12173,7 +12322,7 @@
                 <w:szCs w:val="15"/>
                 <w:rFonts w:ascii="Calibri" w:cs="Calibri" w:eastAsia="Calibri" w:hAnsi="Calibri"/>
               </w:rPr>
-              <w:t xml:space="preserve">67</w:t>
+              <w:t xml:space="preserve">68</w:t>
             </w:r>
           </w:p>
         </w:tc>
@@ -12322,7 +12471,7 @@
                 <w:szCs w:val="15"/>
                 <w:rFonts w:ascii="Calibri" w:cs="Calibri" w:eastAsia="Calibri" w:hAnsi="Calibri"/>
               </w:rPr>
-              <w:t xml:space="preserve">68</w:t>
+              <w:t xml:space="preserve">69</w:t>
             </w:r>
           </w:p>
         </w:tc>
@@ -12471,7 +12620,7 @@
                 <w:szCs w:val="15"/>
                 <w:rFonts w:ascii="Calibri" w:cs="Calibri" w:eastAsia="Calibri" w:hAnsi="Calibri"/>
               </w:rPr>
-              <w:t xml:space="preserve">69</w:t>
+              <w:t xml:space="preserve">70</w:t>
             </w:r>
           </w:p>
         </w:tc>
@@ -12620,7 +12769,7 @@
                 <w:szCs w:val="15"/>
                 <w:rFonts w:ascii="Calibri" w:cs="Calibri" w:eastAsia="Calibri" w:hAnsi="Calibri"/>
               </w:rPr>
-              <w:t xml:space="preserve">70</w:t>
+              <w:t xml:space="preserve">71</w:t>
             </w:r>
           </w:p>
         </w:tc>
@@ -12769,7 +12918,7 @@
                 <w:szCs w:val="15"/>
                 <w:rFonts w:ascii="Calibri" w:cs="Calibri" w:eastAsia="Calibri" w:hAnsi="Calibri"/>
               </w:rPr>
-              <w:t xml:space="preserve">71</w:t>
+              <w:t xml:space="preserve">72</w:t>
             </w:r>
           </w:p>
         </w:tc>
@@ -13134,7 +13283,7 @@
                 <w:szCs w:val="15"/>
                 <w:rFonts w:ascii="Calibri" w:cs="Calibri" w:eastAsia="Calibri" w:hAnsi="Calibri"/>
               </w:rPr>
-              <w:t xml:space="preserve">72</w:t>
+              <w:t xml:space="preserve">73</w:t>
             </w:r>
           </w:p>
         </w:tc>
@@ -13283,7 +13432,7 @@
                 <w:szCs w:val="15"/>
                 <w:rFonts w:ascii="Calibri" w:cs="Calibri" w:eastAsia="Calibri" w:hAnsi="Calibri"/>
               </w:rPr>
-              <w:t xml:space="preserve">73</w:t>
+              <w:t xml:space="preserve">74</w:t>
             </w:r>
           </w:p>
         </w:tc>
@@ -13432,7 +13581,7 @@
                 <w:szCs w:val="15"/>
                 <w:rFonts w:ascii="Calibri" w:cs="Calibri" w:eastAsia="Calibri" w:hAnsi="Calibri"/>
               </w:rPr>
-              <w:t xml:space="preserve">74</w:t>
+              <w:t xml:space="preserve">75</w:t>
             </w:r>
           </w:p>
         </w:tc>

</xml_diff>

<commit_message>
DPS: parâmetros complementares de seleção (TOV, Ifi, lpo, tecnologia, coordenação)
- Sobretensão temporária: UT >= 1,45 x U0 por 5 s; centelhador N-PE no TT
  para 1200 V por 200 ms (IEC 61643-11)
- Tecnologia do DPS classe I: varistor (Up/f = Up + dU) ou centelhador
  (Up/f = max(Up; dU)), com Ifi >= curto-circuito presumido; N-PE Ifi >= 100 A
- Ligação em V (dU desprezível)
- Distância de proteção por oscilação lpo = (Uw - Up/f) / 25 V/m com a lista
  de circuitos terminais mais longos (IEC 62305-4, Anexo D)
- Coordenação entre estágios: 10 m de cabo (IEC 61643-12) ou declaração do
  fabricante; aviso de DR tipo S para DPS a jusante de DR geral
- Memória, tabelas de referência, README e testes atualizados

Co-Authored-By: Claude Opus 5.5 <noreply@anthropic.com>
Claude-Session: https://claude.ai/code/session_01E4Px4gvzC9MkKBX1rn21ys
</commit_message>
<xml_diff>
--- a/exemplo/lista-de-materiais-residencia-unifamiliar-exemplo-r00.docx
+++ b/exemplo/lista-de-materiais-residencia-unifamiliar-exemplo-r00.docx
@@ -5835,7 +5835,7 @@
                 <w:szCs w:val="15"/>
                 <w:rFonts w:ascii="Calibri" w:cs="Calibri" w:eastAsia="Calibri" w:hAnsi="Calibri"/>
               </w:rPr>
-              <w:t xml:space="preserve">DPS classe I+II unipolar — Uc 175 V, Iimp 12,5 kA (10/350 µs), In 20 kA, Up ≤ 1,5 kV</w:t>
+              <w:t xml:space="preserve">DPS classe I+II unipolar (varistor) — Uc 175 V, Iimp 12,5 kA (10/350 µs), In 20 kA, Up ≤ 1,5 kV</w:t>
             </w:r>
           </w:p>
         </w:tc>
@@ -6431,7 +6431,7 @@
                 <w:szCs w:val="15"/>
                 <w:rFonts w:ascii="Calibri" w:cs="Calibri" w:eastAsia="Calibri" w:hAnsi="Calibri"/>
               </w:rPr>
-              <w:t xml:space="preserve">Disjuntor termomagnético 1P curva C 10 A — 6,0 kA</w:t>
+              <w:t xml:space="preserve">DPS classe III junto ao equipamento sensível — Uc 175 V</w:t>
             </w:r>
           </w:p>
         </w:tc>
@@ -6455,7 +6455,7 @@
                 <w:szCs w:val="15"/>
                 <w:rFonts w:ascii="Calibri" w:cs="Calibri" w:eastAsia="Calibri" w:hAnsi="Calibri"/>
               </w:rPr>
-              <w:t xml:space="preserve">ABNT NBR NM 60898</w:t>
+              <w:t xml:space="preserve">ABNT NBR IEC 61643-11</w:t>
             </w:r>
           </w:p>
         </w:tc>
@@ -6527,7 +6527,7 @@
                 <w:szCs w:val="15"/>
                 <w:rFonts w:ascii="Calibri" w:cs="Calibri" w:eastAsia="Calibri" w:hAnsi="Calibri"/>
               </w:rPr>
-              <w:t xml:space="preserve">5</w:t>
+              <w:t xml:space="preserve">2</w:t>
             </w:r>
           </w:p>
         </w:tc>
@@ -6580,7 +6580,7 @@
                 <w:szCs w:val="15"/>
                 <w:rFonts w:ascii="Calibri" w:cs="Calibri" w:eastAsia="Calibri" w:hAnsi="Calibri"/>
               </w:rPr>
-              <w:t xml:space="preserve">Disjuntor termomagnético 1P curva C 16 A — 6,0 kA</w:t>
+              <w:t xml:space="preserve">Disjuntor termomagnético 1P curva C 10 A — 6,0 kA</w:t>
             </w:r>
           </w:p>
         </w:tc>
@@ -6676,7 +6676,7 @@
                 <w:szCs w:val="15"/>
                 <w:rFonts w:ascii="Calibri" w:cs="Calibri" w:eastAsia="Calibri" w:hAnsi="Calibri"/>
               </w:rPr>
-              <w:t xml:space="preserve">4</w:t>
+              <w:t xml:space="preserve">5</w:t>
             </w:r>
           </w:p>
         </w:tc>
@@ -6729,7 +6729,7 @@
                 <w:szCs w:val="15"/>
                 <w:rFonts w:ascii="Calibri" w:cs="Calibri" w:eastAsia="Calibri" w:hAnsi="Calibri"/>
               </w:rPr>
-              <w:t xml:space="preserve">Disjuntor termomagnético 2P curva C 10 A — 6,0 kA</w:t>
+              <w:t xml:space="preserve">Disjuntor termomagnético 1P curva C 16 A — 6,0 kA</w:t>
             </w:r>
           </w:p>
         </w:tc>
@@ -6825,7 +6825,7 @@
                 <w:szCs w:val="15"/>
                 <w:rFonts w:ascii="Calibri" w:cs="Calibri" w:eastAsia="Calibri" w:hAnsi="Calibri"/>
               </w:rPr>
-              <w:t xml:space="preserve">2</w:t>
+              <w:t xml:space="preserve">4</w:t>
             </w:r>
           </w:p>
         </w:tc>
@@ -6878,7 +6878,7 @@
                 <w:szCs w:val="15"/>
                 <w:rFonts w:ascii="Calibri" w:cs="Calibri" w:eastAsia="Calibri" w:hAnsi="Calibri"/>
               </w:rPr>
-              <w:t xml:space="preserve">Disjuntor termomagnético 2P curva C 25 A — 6,0 kA</w:t>
+              <w:t xml:space="preserve">Disjuntor termomagnético 2P curva C 10 A — 6,0 kA</w:t>
             </w:r>
           </w:p>
         </w:tc>
@@ -6974,7 +6974,7 @@
                 <w:szCs w:val="15"/>
                 <w:rFonts w:ascii="Calibri" w:cs="Calibri" w:eastAsia="Calibri" w:hAnsi="Calibri"/>
               </w:rPr>
-              <w:t xml:space="preserve">1</w:t>
+              <w:t xml:space="preserve">2</w:t>
             </w:r>
           </w:p>
         </w:tc>
@@ -7027,7 +7027,7 @@
                 <w:szCs w:val="15"/>
                 <w:rFonts w:ascii="Calibri" w:cs="Calibri" w:eastAsia="Calibri" w:hAnsi="Calibri"/>
               </w:rPr>
-              <w:t xml:space="preserve">Disjuntor termomagnético 2P curva C 40 A — 6,0 kA</w:t>
+              <w:t xml:space="preserve">Disjuntor termomagnético 2P curva C 25 A — 6,0 kA</w:t>
             </w:r>
           </w:p>
         </w:tc>
@@ -7176,7 +7176,7 @@
                 <w:szCs w:val="15"/>
                 <w:rFonts w:ascii="Calibri" w:cs="Calibri" w:eastAsia="Calibri" w:hAnsi="Calibri"/>
               </w:rPr>
-              <w:t xml:space="preserve">Disjuntor termomagnético 3P curva C 63 A — 6,0 kA</w:t>
+              <w:t xml:space="preserve">Disjuntor termomagnético 2P curva C 40 A — 6,0 kA</w:t>
             </w:r>
           </w:p>
         </w:tc>
@@ -7325,7 +7325,7 @@
                 <w:szCs w:val="15"/>
                 <w:rFonts w:ascii="Calibri" w:cs="Calibri" w:eastAsia="Calibri" w:hAnsi="Calibri"/>
               </w:rPr>
-              <w:t xml:space="preserve">Interruptor diferencial-residual (IDR) 2P 25 A — 30 mA</w:t>
+              <w:t xml:space="preserve">Disjuntor termomagnético 3P curva C 63 A — 6,0 kA</w:t>
             </w:r>
           </w:p>
         </w:tc>
@@ -7349,7 +7349,7 @@
                 <w:szCs w:val="15"/>
                 <w:rFonts w:ascii="Calibri" w:cs="Calibri" w:eastAsia="Calibri" w:hAnsi="Calibri"/>
               </w:rPr>
-              <w:t xml:space="preserve">ABNT NBR NM 61008</w:t>
+              <w:t xml:space="preserve">ABNT NBR NM 60898</w:t>
             </w:r>
           </w:p>
         </w:tc>
@@ -7421,7 +7421,7 @@
                 <w:szCs w:val="15"/>
                 <w:rFonts w:ascii="Calibri" w:cs="Calibri" w:eastAsia="Calibri" w:hAnsi="Calibri"/>
               </w:rPr>
-              <w:t xml:space="preserve">9</w:t>
+              <w:t xml:space="preserve">1</w:t>
             </w:r>
           </w:p>
         </w:tc>
@@ -7474,7 +7474,7 @@
                 <w:szCs w:val="15"/>
                 <w:rFonts w:ascii="Calibri" w:cs="Calibri" w:eastAsia="Calibri" w:hAnsi="Calibri"/>
               </w:rPr>
-              <w:t xml:space="preserve">Interruptor diferencial-residual (IDR) 2P 40 A — 30 mA</w:t>
+              <w:t xml:space="preserve">Interruptor diferencial-residual (IDR) 2P 25 A — 30 mA</w:t>
             </w:r>
           </w:p>
         </w:tc>
@@ -7570,7 +7570,7 @@
                 <w:szCs w:val="15"/>
                 <w:rFonts w:ascii="Calibri" w:cs="Calibri" w:eastAsia="Calibri" w:hAnsi="Calibri"/>
               </w:rPr>
-              <w:t xml:space="preserve">1</w:t>
+              <w:t xml:space="preserve">9</w:t>
             </w:r>
           </w:p>
         </w:tc>
@@ -7600,6 +7600,155 @@
                 <w:rFonts w:ascii="Calibri" w:cs="Calibri" w:eastAsia="Calibri" w:hAnsi="Calibri"/>
               </w:rPr>
               <w:t xml:space="preserve">45</w:t>
+            </w:r>
+          </w:p>
+        </w:tc>
+        <w:tc>
+          <w:tcPr>
+            <w:tcW w:type="dxa" w:w="4390"/>
+            <w:tcMar>
+              <w:top w:type="dxa" w:w="30"/>
+              <w:left w:type="dxa" w:w="70"/>
+              <w:bottom w:type="dxa" w:w="30"/>
+              <w:right w:type="dxa" w:w="70"/>
+            </w:tcMar>
+          </w:tcPr>
+          <w:p>
+            <w:pPr>
+              <w:jc w:val="left"/>
+            </w:pPr>
+            <w:r>
+              <w:rPr>
+                <w:sz w:val="15"/>
+                <w:szCs w:val="15"/>
+                <w:rFonts w:ascii="Calibri" w:cs="Calibri" w:eastAsia="Calibri" w:hAnsi="Calibri"/>
+              </w:rPr>
+              <w:t xml:space="preserve">Interruptor diferencial-residual (IDR) 2P 40 A — 30 mA</w:t>
+            </w:r>
+          </w:p>
+        </w:tc>
+        <w:tc>
+          <w:tcPr>
+            <w:tcW w:type="dxa" w:w="1951"/>
+            <w:tcMar>
+              <w:top w:type="dxa" w:w="30"/>
+              <w:left w:type="dxa" w:w="70"/>
+              <w:bottom w:type="dxa" w:w="30"/>
+              <w:right w:type="dxa" w:w="70"/>
+            </w:tcMar>
+          </w:tcPr>
+          <w:p>
+            <w:pPr>
+              <w:jc w:val="left"/>
+            </w:pPr>
+            <w:r>
+              <w:rPr>
+                <w:sz w:val="15"/>
+                <w:szCs w:val="15"/>
+                <w:rFonts w:ascii="Calibri" w:cs="Calibri" w:eastAsia="Calibri" w:hAnsi="Calibri"/>
+              </w:rPr>
+              <w:t xml:space="preserve">ABNT NBR NM 61008</w:t>
+            </w:r>
+          </w:p>
+        </w:tc>
+        <w:tc>
+          <w:tcPr>
+            <w:tcW w:type="dxa" w:w="1171"/>
+            <w:tcMar>
+              <w:top w:type="dxa" w:w="30"/>
+              <w:left w:type="dxa" w:w="70"/>
+              <w:bottom w:type="dxa" w:w="30"/>
+              <w:right w:type="dxa" w:w="70"/>
+            </w:tcMar>
+          </w:tcPr>
+          <w:p>
+            <w:pPr>
+              <w:jc w:val="left"/>
+            </w:pPr>
+            <w:r>
+              <w:rPr>
+                <w:sz w:val="15"/>
+                <w:szCs w:val="15"/>
+                <w:rFonts w:ascii="Calibri" w:cs="Calibri" w:eastAsia="Calibri" w:hAnsi="Calibri"/>
+              </w:rPr>
+              <w:t xml:space="preserve">—</w:t>
+            </w:r>
+          </w:p>
+        </w:tc>
+        <w:tc>
+          <w:tcPr>
+            <w:tcW w:type="dxa" w:w="683"/>
+            <w:tcMar>
+              <w:top w:type="dxa" w:w="30"/>
+              <w:left w:type="dxa" w:w="70"/>
+              <w:bottom w:type="dxa" w:w="30"/>
+              <w:right w:type="dxa" w:w="70"/>
+            </w:tcMar>
+          </w:tcPr>
+          <w:p>
+            <w:pPr>
+              <w:jc w:val="left"/>
+            </w:pPr>
+            <w:r>
+              <w:rPr>
+                <w:sz w:val="15"/>
+                <w:szCs w:val="15"/>
+                <w:rFonts w:ascii="Calibri" w:cs="Calibri" w:eastAsia="Calibri" w:hAnsi="Calibri"/>
+              </w:rPr>
+              <w:t xml:space="preserve">un</w:t>
+            </w:r>
+          </w:p>
+        </w:tc>
+        <w:tc>
+          <w:tcPr>
+            <w:tcW w:type="dxa" w:w="878"/>
+            <w:tcMar>
+              <w:top w:type="dxa" w:w="30"/>
+              <w:left w:type="dxa" w:w="70"/>
+              <w:bottom w:type="dxa" w:w="30"/>
+              <w:right w:type="dxa" w:w="70"/>
+            </w:tcMar>
+          </w:tcPr>
+          <w:p>
+            <w:pPr>
+              <w:jc w:val="right"/>
+            </w:pPr>
+            <w:r>
+              <w:rPr>
+                <w:sz w:val="15"/>
+                <w:szCs w:val="15"/>
+                <w:rFonts w:ascii="Calibri" w:cs="Calibri" w:eastAsia="Calibri" w:hAnsi="Calibri"/>
+              </w:rPr>
+              <w:t xml:space="preserve">1</w:t>
+            </w:r>
+          </w:p>
+        </w:tc>
+      </w:tr>
+      <w:tr>
+        <w:trPr>
+          <w:cantSplit/>
+        </w:trPr>
+        <w:tc>
+          <w:tcPr>
+            <w:tcW w:type="dxa" w:w="683"/>
+            <w:tcMar>
+              <w:top w:type="dxa" w:w="30"/>
+              <w:left w:type="dxa" w:w="70"/>
+              <w:bottom w:type="dxa" w:w="30"/>
+              <w:right w:type="dxa" w:w="70"/>
+            </w:tcMar>
+          </w:tcPr>
+          <w:p>
+            <w:pPr>
+              <w:jc w:val="left"/>
+            </w:pPr>
+            <w:r>
+              <w:rPr>
+                <w:sz w:val="15"/>
+                <w:szCs w:val="15"/>
+                <w:rFonts w:ascii="Calibri" w:cs="Calibri" w:eastAsia="Calibri" w:hAnsi="Calibri"/>
+              </w:rPr>
+              <w:t xml:space="preserve">46</w:t>
             </w:r>
           </w:p>
         </w:tc>
@@ -7964,7 +8113,7 @@
                 <w:szCs w:val="15"/>
                 <w:rFonts w:ascii="Calibri" w:cs="Calibri" w:eastAsia="Calibri" w:hAnsi="Calibri"/>
               </w:rPr>
-              <w:t xml:space="preserve">46</w:t>
+              <w:t xml:space="preserve">47</w:t>
             </w:r>
           </w:p>
         </w:tc>
@@ -8113,7 +8262,7 @@
                 <w:szCs w:val="15"/>
                 <w:rFonts w:ascii="Calibri" w:cs="Calibri" w:eastAsia="Calibri" w:hAnsi="Calibri"/>
               </w:rPr>
-              <w:t xml:space="preserve">47</w:t>
+              <w:t xml:space="preserve">48</w:t>
             </w:r>
           </w:p>
         </w:tc>
@@ -8262,7 +8411,7 @@
                 <w:szCs w:val="15"/>
                 <w:rFonts w:ascii="Calibri" w:cs="Calibri" w:eastAsia="Calibri" w:hAnsi="Calibri"/>
               </w:rPr>
-              <w:t xml:space="preserve">48</w:t>
+              <w:t xml:space="preserve">49</w:t>
             </w:r>
           </w:p>
         </w:tc>
@@ -8627,7 +8776,7 @@
                 <w:szCs w:val="15"/>
                 <w:rFonts w:ascii="Calibri" w:cs="Calibri" w:eastAsia="Calibri" w:hAnsi="Calibri"/>
               </w:rPr>
-              <w:t xml:space="preserve">49</w:t>
+              <w:t xml:space="preserve">50</w:t>
             </w:r>
           </w:p>
         </w:tc>
@@ -8776,7 +8925,7 @@
                 <w:szCs w:val="15"/>
                 <w:rFonts w:ascii="Calibri" w:cs="Calibri" w:eastAsia="Calibri" w:hAnsi="Calibri"/>
               </w:rPr>
-              <w:t xml:space="preserve">50</w:t>
+              <w:t xml:space="preserve">51</w:t>
             </w:r>
           </w:p>
         </w:tc>
@@ -8925,7 +9074,7 @@
                 <w:szCs w:val="15"/>
                 <w:rFonts w:ascii="Calibri" w:cs="Calibri" w:eastAsia="Calibri" w:hAnsi="Calibri"/>
               </w:rPr>
-              <w:t xml:space="preserve">51</w:t>
+              <w:t xml:space="preserve">52</w:t>
             </w:r>
           </w:p>
         </w:tc>
@@ -9074,7 +9223,7 @@
                 <w:szCs w:val="15"/>
                 <w:rFonts w:ascii="Calibri" w:cs="Calibri" w:eastAsia="Calibri" w:hAnsi="Calibri"/>
               </w:rPr>
-              <w:t xml:space="preserve">52</w:t>
+              <w:t xml:space="preserve">53</w:t>
             </w:r>
           </w:p>
         </w:tc>
@@ -9223,7 +9372,7 @@
                 <w:szCs w:val="15"/>
                 <w:rFonts w:ascii="Calibri" w:cs="Calibri" w:eastAsia="Calibri" w:hAnsi="Calibri"/>
               </w:rPr>
-              <w:t xml:space="preserve">53</w:t>
+              <w:t xml:space="preserve">54</w:t>
             </w:r>
           </w:p>
         </w:tc>
@@ -9372,7 +9521,7 @@
                 <w:szCs w:val="15"/>
                 <w:rFonts w:ascii="Calibri" w:cs="Calibri" w:eastAsia="Calibri" w:hAnsi="Calibri"/>
               </w:rPr>
-              <w:t xml:space="preserve">54</w:t>
+              <w:t xml:space="preserve">55</w:t>
             </w:r>
           </w:p>
         </w:tc>
@@ -9737,7 +9886,7 @@
                 <w:szCs w:val="15"/>
                 <w:rFonts w:ascii="Calibri" w:cs="Calibri" w:eastAsia="Calibri" w:hAnsi="Calibri"/>
               </w:rPr>
-              <w:t xml:space="preserve">55</w:t>
+              <w:t xml:space="preserve">56</w:t>
             </w:r>
           </w:p>
         </w:tc>
@@ -9886,7 +10035,7 @@
                 <w:szCs w:val="15"/>
                 <w:rFonts w:ascii="Calibri" w:cs="Calibri" w:eastAsia="Calibri" w:hAnsi="Calibri"/>
               </w:rPr>
-              <w:t xml:space="preserve">56</w:t>
+              <w:t xml:space="preserve">57</w:t>
             </w:r>
           </w:p>
         </w:tc>
@@ -10251,7 +10400,7 @@
                 <w:szCs w:val="15"/>
                 <w:rFonts w:ascii="Calibri" w:cs="Calibri" w:eastAsia="Calibri" w:hAnsi="Calibri"/>
               </w:rPr>
-              <w:t xml:space="preserve">57</w:t>
+              <w:t xml:space="preserve">58</w:t>
             </w:r>
           </w:p>
         </w:tc>
@@ -10400,7 +10549,7 @@
                 <w:szCs w:val="15"/>
                 <w:rFonts w:ascii="Calibri" w:cs="Calibri" w:eastAsia="Calibri" w:hAnsi="Calibri"/>
               </w:rPr>
-              <w:t xml:space="preserve">58</w:t>
+              <w:t xml:space="preserve">59</w:t>
             </w:r>
           </w:p>
         </w:tc>
@@ -10549,7 +10698,7 @@
                 <w:szCs w:val="15"/>
                 <w:rFonts w:ascii="Calibri" w:cs="Calibri" w:eastAsia="Calibri" w:hAnsi="Calibri"/>
               </w:rPr>
-              <w:t xml:space="preserve">59</w:t>
+              <w:t xml:space="preserve">60</w:t>
             </w:r>
           </w:p>
         </w:tc>
@@ -10698,7 +10847,7 @@
                 <w:szCs w:val="15"/>
                 <w:rFonts w:ascii="Calibri" w:cs="Calibri" w:eastAsia="Calibri" w:hAnsi="Calibri"/>
               </w:rPr>
-              <w:t xml:space="preserve">60</w:t>
+              <w:t xml:space="preserve">61</w:t>
             </w:r>
           </w:p>
         </w:tc>
@@ -10847,7 +10996,7 @@
                 <w:szCs w:val="15"/>
                 <w:rFonts w:ascii="Calibri" w:cs="Calibri" w:eastAsia="Calibri" w:hAnsi="Calibri"/>
               </w:rPr>
-              <w:t xml:space="preserve">61</w:t>
+              <w:t xml:space="preserve">62</w:t>
             </w:r>
           </w:p>
         </w:tc>
@@ -11212,7 +11361,7 @@
                 <w:szCs w:val="15"/>
                 <w:rFonts w:ascii="Calibri" w:cs="Calibri" w:eastAsia="Calibri" w:hAnsi="Calibri"/>
               </w:rPr>
-              <w:t xml:space="preserve">62</w:t>
+              <w:t xml:space="preserve">63</w:t>
             </w:r>
           </w:p>
         </w:tc>
@@ -11361,7 +11510,7 @@
                 <w:szCs w:val="15"/>
                 <w:rFonts w:ascii="Calibri" w:cs="Calibri" w:eastAsia="Calibri" w:hAnsi="Calibri"/>
               </w:rPr>
-              <w:t xml:space="preserve">63</w:t>
+              <w:t xml:space="preserve">64</w:t>
             </w:r>
           </w:p>
         </w:tc>
@@ -11510,7 +11659,7 @@
                 <w:szCs w:val="15"/>
                 <w:rFonts w:ascii="Calibri" w:cs="Calibri" w:eastAsia="Calibri" w:hAnsi="Calibri"/>
               </w:rPr>
-              <w:t xml:space="preserve">64</w:t>
+              <w:t xml:space="preserve">65</w:t>
             </w:r>
           </w:p>
         </w:tc>
@@ -11659,7 +11808,7 @@
                 <w:szCs w:val="15"/>
                 <w:rFonts w:ascii="Calibri" w:cs="Calibri" w:eastAsia="Calibri" w:hAnsi="Calibri"/>
               </w:rPr>
-              <w:t xml:space="preserve">65</w:t>
+              <w:t xml:space="preserve">66</w:t>
             </w:r>
           </w:p>
         </w:tc>
@@ -11808,7 +11957,7 @@
                 <w:szCs w:val="15"/>
                 <w:rFonts w:ascii="Calibri" w:cs="Calibri" w:eastAsia="Calibri" w:hAnsi="Calibri"/>
               </w:rPr>
-              <w:t xml:space="preserve">66</w:t>
+              <w:t xml:space="preserve">67</w:t>
             </w:r>
           </w:p>
         </w:tc>
@@ -11957,7 +12106,7 @@
                 <w:szCs w:val="15"/>
                 <w:rFonts w:ascii="Calibri" w:cs="Calibri" w:eastAsia="Calibri" w:hAnsi="Calibri"/>
               </w:rPr>
-              <w:t xml:space="preserve">67</w:t>
+              <w:t xml:space="preserve">68</w:t>
             </w:r>
           </w:p>
         </w:tc>
@@ -12106,7 +12255,7 @@
                 <w:szCs w:val="15"/>
                 <w:rFonts w:ascii="Calibri" w:cs="Calibri" w:eastAsia="Calibri" w:hAnsi="Calibri"/>
               </w:rPr>
-              <w:t xml:space="preserve">68</w:t>
+              <w:t xml:space="preserve">69</w:t>
             </w:r>
           </w:p>
         </w:tc>
@@ -12471,7 +12620,7 @@
                 <w:szCs w:val="15"/>
                 <w:rFonts w:ascii="Calibri" w:cs="Calibri" w:eastAsia="Calibri" w:hAnsi="Calibri"/>
               </w:rPr>
-              <w:t xml:space="preserve">69</w:t>
+              <w:t xml:space="preserve">70</w:t>
             </w:r>
           </w:p>
         </w:tc>
@@ -12620,7 +12769,7 @@
                 <w:szCs w:val="15"/>
                 <w:rFonts w:ascii="Calibri" w:cs="Calibri" w:eastAsia="Calibri" w:hAnsi="Calibri"/>
               </w:rPr>
-              <w:t xml:space="preserve">70</w:t>
+              <w:t xml:space="preserve">71</w:t>
             </w:r>
           </w:p>
         </w:tc>
@@ -12769,7 +12918,7 @@
                 <w:szCs w:val="15"/>
                 <w:rFonts w:ascii="Calibri" w:cs="Calibri" w:eastAsia="Calibri" w:hAnsi="Calibri"/>
               </w:rPr>
-              <w:t xml:space="preserve">71</w:t>
+              <w:t xml:space="preserve">72</w:t>
             </w:r>
           </w:p>
         </w:tc>
@@ -12918,7 +13067,7 @@
                 <w:szCs w:val="15"/>
                 <w:rFonts w:ascii="Calibri" w:cs="Calibri" w:eastAsia="Calibri" w:hAnsi="Calibri"/>
               </w:rPr>
-              <w:t xml:space="preserve">72</w:t>
+              <w:t xml:space="preserve">73</w:t>
             </w:r>
           </w:p>
         </w:tc>
@@ -13067,7 +13216,7 @@
                 <w:szCs w:val="15"/>
                 <w:rFonts w:ascii="Calibri" w:cs="Calibri" w:eastAsia="Calibri" w:hAnsi="Calibri"/>
               </w:rPr>
-              <w:t xml:space="preserve">73</w:t>
+              <w:t xml:space="preserve">74</w:t>
             </w:r>
           </w:p>
         </w:tc>
@@ -13216,7 +13365,7 @@
                 <w:szCs w:val="15"/>
                 <w:rFonts w:ascii="Calibri" w:cs="Calibri" w:eastAsia="Calibri" w:hAnsi="Calibri"/>
               </w:rPr>
-              <w:t xml:space="preserve">74</w:t>
+              <w:t xml:space="preserve">75</w:t>
             </w:r>
           </w:p>
         </w:tc>
@@ -13365,7 +13514,7 @@
                 <w:szCs w:val="15"/>
                 <w:rFonts w:ascii="Calibri" w:cs="Calibri" w:eastAsia="Calibri" w:hAnsi="Calibri"/>
               </w:rPr>
-              <w:t xml:space="preserve">75</w:t>
+              <w:t xml:space="preserve">76</w:t>
             </w:r>
           </w:p>
         </w:tc>
@@ -13514,7 +13663,7 @@
                 <w:szCs w:val="15"/>
                 <w:rFonts w:ascii="Calibri" w:cs="Calibri" w:eastAsia="Calibri" w:hAnsi="Calibri"/>
               </w:rPr>
-              <w:t xml:space="preserve">76</w:t>
+              <w:t xml:space="preserve">77</w:t>
             </w:r>
           </w:p>
         </w:tc>
@@ -13663,7 +13812,7 @@
                 <w:szCs w:val="15"/>
                 <w:rFonts w:ascii="Calibri" w:cs="Calibri" w:eastAsia="Calibri" w:hAnsi="Calibri"/>
               </w:rPr>
-              <w:t xml:space="preserve">77</w:t>
+              <w:t xml:space="preserve">78</w:t>
             </w:r>
           </w:p>
         </w:tc>
@@ -13812,7 +13961,7 @@
                 <w:szCs w:val="15"/>
                 <w:rFonts w:ascii="Calibri" w:cs="Calibri" w:eastAsia="Calibri" w:hAnsi="Calibri"/>
               </w:rPr>
-              <w:t xml:space="preserve">78</w:t>
+              <w:t xml:space="preserve">79</w:t>
             </w:r>
           </w:p>
         </w:tc>
@@ -13961,7 +14110,7 @@
                 <w:szCs w:val="15"/>
                 <w:rFonts w:ascii="Calibri" w:cs="Calibri" w:eastAsia="Calibri" w:hAnsi="Calibri"/>
               </w:rPr>
-              <w:t xml:space="preserve">79</w:t>
+              <w:t xml:space="preserve">80</w:t>
             </w:r>
           </w:p>
         </w:tc>
@@ -14326,7 +14475,7 @@
                 <w:szCs w:val="15"/>
                 <w:rFonts w:ascii="Calibri" w:cs="Calibri" w:eastAsia="Calibri" w:hAnsi="Calibri"/>
               </w:rPr>
-              <w:t xml:space="preserve">80</w:t>
+              <w:t xml:space="preserve">81</w:t>
             </w:r>
           </w:p>
         </w:tc>
@@ -14475,7 +14624,7 @@
                 <w:szCs w:val="15"/>
                 <w:rFonts w:ascii="Calibri" w:cs="Calibri" w:eastAsia="Calibri" w:hAnsi="Calibri"/>
               </w:rPr>
-              <w:t xml:space="preserve">81</w:t>
+              <w:t xml:space="preserve">82</w:t>
             </w:r>
           </w:p>
         </w:tc>
@@ -14624,7 +14773,7 @@
                 <w:szCs w:val="15"/>
                 <w:rFonts w:ascii="Calibri" w:cs="Calibri" w:eastAsia="Calibri" w:hAnsi="Calibri"/>
               </w:rPr>
-              <w:t xml:space="preserve">82</w:t>
+              <w:t xml:space="preserve">83</w:t>
             </w:r>
           </w:p>
         </w:tc>
@@ -14773,7 +14922,7 @@
                 <w:szCs w:val="15"/>
                 <w:rFonts w:ascii="Calibri" w:cs="Calibri" w:eastAsia="Calibri" w:hAnsi="Calibri"/>
               </w:rPr>
-              <w:t xml:space="preserve">83</w:t>
+              <w:t xml:space="preserve">84</w:t>
             </w:r>
           </w:p>
         </w:tc>
@@ -14922,7 +15071,7 @@
                 <w:szCs w:val="15"/>
                 <w:rFonts w:ascii="Calibri" w:cs="Calibri" w:eastAsia="Calibri" w:hAnsi="Calibri"/>
               </w:rPr>
-              <w:t xml:space="preserve">84</w:t>
+              <w:t xml:space="preserve">85</w:t>
             </w:r>
           </w:p>
         </w:tc>
@@ -15071,7 +15220,7 @@
                 <w:szCs w:val="15"/>
                 <w:rFonts w:ascii="Calibri" w:cs="Calibri" w:eastAsia="Calibri" w:hAnsi="Calibri"/>
               </w:rPr>
-              <w:t xml:space="preserve">85</w:t>
+              <w:t xml:space="preserve">86</w:t>
             </w:r>
           </w:p>
         </w:tc>
@@ -15220,7 +15369,7 @@
                 <w:szCs w:val="15"/>
                 <w:rFonts w:ascii="Calibri" w:cs="Calibri" w:eastAsia="Calibri" w:hAnsi="Calibri"/>
               </w:rPr>
-              <w:t xml:space="preserve">86</w:t>
+              <w:t xml:space="preserve">87</w:t>
             </w:r>
           </w:p>
         </w:tc>
@@ -15585,7 +15734,7 @@
                 <w:szCs w:val="15"/>
                 <w:rFonts w:ascii="Calibri" w:cs="Calibri" w:eastAsia="Calibri" w:hAnsi="Calibri"/>
               </w:rPr>
-              <w:t xml:space="preserve">87</w:t>
+              <w:t xml:space="preserve">88</w:t>
             </w:r>
           </w:p>
         </w:tc>
@@ -15734,7 +15883,7 @@
                 <w:szCs w:val="15"/>
                 <w:rFonts w:ascii="Calibri" w:cs="Calibri" w:eastAsia="Calibri" w:hAnsi="Calibri"/>
               </w:rPr>
-              <w:t xml:space="preserve">88</w:t>
+              <w:t xml:space="preserve">89</w:t>
             </w:r>
           </w:p>
         </w:tc>
@@ -15883,7 +16032,7 @@
                 <w:szCs w:val="15"/>
                 <w:rFonts w:ascii="Calibri" w:cs="Calibri" w:eastAsia="Calibri" w:hAnsi="Calibri"/>
               </w:rPr>
-              <w:t xml:space="preserve">89</w:t>
+              <w:t xml:space="preserve">90</w:t>
             </w:r>
           </w:p>
         </w:tc>

</xml_diff>

<commit_message>
DPS: métodos de fabricantes (catálogo Siemens 5SD7) e retirada do TOV
- Obrigatoriedade pela NBR 5410 (AQ3 com SPDA; AQ2 com linha aérea e Td > 25)
- Corrente nominal da classe II pelo nível de exposição F = Td x (1,6 + 2 LBT + d)
  (In 5/10/20 kA) ou pelas faixas de exposição dos catálogos
- Seção dos condutores de ligação pela proteção a montante, ligação em série (V)
  ou paralelo (T), com fusível F2 quando exigido
- Distância de proteção: lpo (IEC 62305-4) ou 30 m (prática de fabricante)
- Uc e In do produto; Up fase-PE na ligação n+1; neutro aterrado no BEP
  (TN-C-S na entrada) dispensa o módulo N-PE (Figura 13, esquema 1)
- DR a montante com imunidade >= 3 kA (8/20 us); Ifi N-PE >= 100 A (NBR 5410)
- Retirada a verificação de sobretensão temporária (TOV)
- Memória, tabelas de referência, diagramas, README e testes atualizados

Co-Authored-By: Claude Opus 5.5 <noreply@anthropic.com>
Claude-Session: https://claude.ai/code/session_01E4Px4gvzC9MkKBX1rn21ys
</commit_message>
<xml_diff>
--- a/exemplo/lista-de-materiais-residencia-unifamiliar-exemplo-r00.docx
+++ b/exemplo/lista-de-materiais-residencia-unifamiliar-exemplo-r00.docx
@@ -5984,7 +5984,7 @@
                 <w:szCs w:val="15"/>
                 <w:rFonts w:ascii="Calibri" w:cs="Calibri" w:eastAsia="Calibri" w:hAnsi="Calibri"/>
               </w:rPr>
-              <w:t xml:space="preserve">Condutor de cobre verde-amarelo 16 mm² para ligação dos DPS</w:t>
+              <w:t xml:space="preserve">Condutor de cobre 16 mm² para ligação dos DPS (fases e PE)</w:t>
             </w:r>
           </w:p>
         </w:tc>
@@ -6282,7 +6282,7 @@
                 <w:szCs w:val="15"/>
                 <w:rFonts w:ascii="Calibri" w:cs="Calibri" w:eastAsia="Calibri" w:hAnsi="Calibri"/>
               </w:rPr>
-              <w:t xml:space="preserve">Condutor de cobre verde-amarelo 4 mm² para ligação dos DPS</w:t>
+              <w:t xml:space="preserve">Condutor de cobre 10 mm² para ligação dos DPS (fases e PE)</w:t>
             </w:r>
           </w:p>
         </w:tc>

</xml_diff>